<commit_message>
Deliverable exports: code blocks now wrap in PDF and DOCX (field-install finding #3)
PDF: pandoc's injected highlighting CSS forces no-wrap (pre > code.sourceCode
{ white-space: pre } + per-line inline-block spans whose shrink-to-fit width
ignores overflow-wrap in weasyprint) — long code lines ran off the page edge
and were cut. deliverable.css now matches those selectors after pandoc's block:
pre-wrap + overflow-wrap:anywhere, spans flattened to display:inline (the
literal newlines between them keep line structure), pandoc's hanging-indent
neutralized. Verified on a render with a 170-char JWT token: wraps fully in-page.

DOCX: pandoc's default SourceCode paragraph style ships wordWrap=off, letting
long tokens overflow the margin in Word. reference.docx now defines SourceCode
itself (same style minus the flag), which takes precedence.
</commit_message>
<xml_diff>
--- a/templates/skills/deliverable-export/templates/reference.docx
+++ b/templates/skills/deliverable-export/templates/reference.docx
@@ -1135,6 +1135,11 @@
       <w:bCs w:val="0"/>
       <w:color w:val="365F91" w:themeColor="accent1" w:themeShade="BF"/>
     </w:rPr>
+  </w:style>
+  <w:style w:type="paragraph" w:customStyle="1" w:styleId="SourceCode">
+    <w:name w:val="Source Code"/>
+    <w:basedOn w:val="Normal"/>
+    <w:link w:val="VerbatimChar"/>
   </w:style>
 </w:styles>
 </file>

</xml_diff>